<commit_message>
style(docs): retirar todo el dorado/amarillo del PDF y Word del documento
El manual de marca de RISKS no contempla acentos dorados/amarillos. Cambios:

PDF:
- Variables CSS --gold y --gold-50 reasignadas a navy-900 y slate-100 respectivamente — efecto en cascada sobre las 12 superficies que las usaban: brand-strip border-left, h1 border-bottom, h3 color, callout border + background, .stepper number, .toc border-left y .cover-norm color.
- Las dos barras de la portada y el subrayado de cada h1 quedan navy. Los callouts pasan a fondo gris muy claro + borde navy. Los numerales 1/2/3/4 del stepper pasan a navy.

Word:
- Constante GOLD reasignada a NAVY (negro azulado del brand). Afecta Heading3, eyebrow de la portada, border-left de la brand-strip y el border-bottom del header.
- Fondo del callout hardcoded en hex FFF8E6 (amarillo claro) reemplazado por SLATE_100 (#F1F5F9, gris claro).
</commit_message>
<xml_diff>
--- a/docs/Proceso-Certificacion-okacreditado.docx
+++ b/docs/Proceso-Certificacion-okacreditado.docx
@@ -75,7 +75,7 @@
           <w:rFonts w:ascii="Figtree" w:cs="Figtree" w:eastAsia="Figtree" w:hAnsi="Figtree"/>
           <w:b/>
           <w:bCs/>
-          <w:color w:val="B58B2A"/>
+          <w:color w:val="0B1F3A"/>
           <w:sz w:val="22"/>
           <w:szCs w:val="22"/>
         </w:rPr>
@@ -206,7 +206,7 @@
           <w:rFonts w:ascii="Inter" w:cs="Inter" w:eastAsia="Inter" w:hAnsi="Inter"/>
           <w:b/>
           <w:bCs/>
-          <w:color w:val="B58B2A"/>
+          <w:color w:val="0B1F3A"/>
           <w:sz w:val="16"/>
           <w:szCs w:val="16"/>
         </w:rPr>
@@ -323,7 +323,7 @@
             <w:tcW w:type="dxa" w:w="5616"/>
             <w:tcBorders>
               <w:top w:val="none" w:color="FFFFFF" w:sz="0"/>
-              <w:left w:val="single" w:color="B58B2A" w:sz="32"/>
+              <w:left w:val="single" w:color="0B1F3A" w:sz="32"/>
               <w:bottom w:val="none" w:color="FFFFFF" w:sz="0"/>
               <w:right w:val="none" w:color="FFFFFF" w:sz="0"/>
             </w:tcBorders>
@@ -585,12 +585,12 @@
           <w:tcPr>
             <w:tcW w:type="dxa" w:w="9360"/>
             <w:tcBorders>
-              <w:top w:val="single" w:color="B58B2A" w:sz="24"/>
-              <w:left w:val="single" w:color="B58B2A" w:sz="24"/>
-              <w:bottom w:val="single" w:color="B58B2A" w:sz="6"/>
-              <w:right w:val="single" w:color="B58B2A" w:sz="6"/>
-            </w:tcBorders>
-            <w:shd w:fill="FFF8E6" w:color="auto" w:val="clear"/>
+              <w:top w:val="single" w:color="0B1F3A" w:sz="24"/>
+              <w:left w:val="single" w:color="0B1F3A" w:sz="24"/>
+              <w:bottom w:val="single" w:color="0B1F3A" w:sz="6"/>
+              <w:right w:val="single" w:color="0B1F3A" w:sz="6"/>
+            </w:tcBorders>
+            <w:shd w:fill="F1F5F9" w:color="auto" w:val="clear"/>
             <w:tcMar>
               <w:top w:type="dxa" w:w="200"/>
               <w:left w:type="dxa" w:w="240"/>
@@ -1402,7 +1402,7 @@
               <w:bottom w:val="single" w:color="059669" w:sz="6"/>
               <w:right w:val="single" w:color="059669" w:sz="6"/>
             </w:tcBorders>
-            <w:shd w:fill="FFF8E6" w:color="auto" w:val="clear"/>
+            <w:shd w:fill="F1F5F9" w:color="auto" w:val="clear"/>
             <w:tcMar>
               <w:top w:type="dxa" w:w="200"/>
               <w:left w:type="dxa" w:w="240"/>
@@ -3172,12 +3172,12 @@
           <w:tcPr>
             <w:tcW w:type="dxa" w:w="9360"/>
             <w:tcBorders>
-              <w:top w:val="single" w:color="B58B2A" w:sz="24"/>
-              <w:left w:val="single" w:color="B58B2A" w:sz="24"/>
-              <w:bottom w:val="single" w:color="B58B2A" w:sz="6"/>
-              <w:right w:val="single" w:color="B58B2A" w:sz="6"/>
-            </w:tcBorders>
-            <w:shd w:fill="FFF8E6" w:color="auto" w:val="clear"/>
+              <w:top w:val="single" w:color="0B1F3A" w:sz="24"/>
+              <w:left w:val="single" w:color="0B1F3A" w:sz="24"/>
+              <w:bottom w:val="single" w:color="0B1F3A" w:sz="6"/>
+              <w:right w:val="single" w:color="0B1F3A" w:sz="6"/>
+            </w:tcBorders>
+            <w:shd w:fill="F1F5F9" w:color="auto" w:val="clear"/>
             <w:tcMar>
               <w:top w:type="dxa" w:w="200"/>
               <w:left w:type="dxa" w:w="240"/>
@@ -4693,12 +4693,12 @@
           <w:tcPr>
             <w:tcW w:type="dxa" w:w="9360"/>
             <w:tcBorders>
-              <w:top w:val="single" w:color="B58B2A" w:sz="24"/>
-              <w:left w:val="single" w:color="B58B2A" w:sz="24"/>
-              <w:bottom w:val="single" w:color="B58B2A" w:sz="6"/>
-              <w:right w:val="single" w:color="B58B2A" w:sz="6"/>
-            </w:tcBorders>
-            <w:shd w:fill="FFF8E6" w:color="auto" w:val="clear"/>
+              <w:top w:val="single" w:color="0B1F3A" w:sz="24"/>
+              <w:left w:val="single" w:color="0B1F3A" w:sz="24"/>
+              <w:bottom w:val="single" w:color="0B1F3A" w:sz="6"/>
+              <w:right w:val="single" w:color="0B1F3A" w:sz="6"/>
+            </w:tcBorders>
+            <w:shd w:fill="F1F5F9" w:color="auto" w:val="clear"/>
             <w:tcMar>
               <w:top w:type="dxa" w:w="200"/>
               <w:left w:type="dxa" w:w="240"/>
@@ -4899,7 +4899,7 @@
   <w:p>
     <w:pPr>
       <w:pBdr>
-        <w:bottom w:val="single" w:color="B58B2A" w:sz="6" w:space="6"/>
+        <w:bottom w:val="single" w:color="0B1F3A" w:sz="6" w:space="6"/>
       </w:pBdr>
       <w:tabs>
         <w:tab w:val="right" w:pos="9026"/>
@@ -5327,7 +5327,7 @@
       <w:rFonts w:ascii="Figtree" w:cs="Figtree" w:eastAsia="Figtree" w:hAnsi="Figtree"/>
       <w:b/>
       <w:bCs/>
-      <w:color w:val="B58B2A"/>
+      <w:color w:val="0B1F3A"/>
       <w:sz w:val="24"/>
       <w:szCs w:val="24"/>
     </w:rPr>

</xml_diff>